<commit_message>
Trim the About three characters under the LinkedIn ceiling
Co-Authored-By: Claude Opus 5 <noreply@anthropic.com>
Claude-Session: https://claude.ai/code/session_01W9UtE7X76spacWeSvBH7tv
</commit_message>
<xml_diff>
--- a/research/LinkedIn_About_2026-08-09.docx
+++ b/research/LinkedIn_About_2026-08-09.docx
@@ -19,7 +19,7 @@
         <w:rPr>
           <w:b/>
         </w:rPr>
-        <w:t xml:space="preserve">Every figure verified against the study database this date. Character count 2603 of the 2,600 LinkedIn allows.</w:t>
+        <w:t xml:space="preserve">Every figure verified against the study database this date. Character count 2594 of the 2,600 LinkedIn allows.</w:t>
       </w:r>
     </w:p>
     <w:p>
@@ -162,7 +162,7 @@
         <w:spacing w:after="140"/>
       </w:pPr>
       <w:r>
-        <w:t xml:space="preserve">🎙️ Featured on The Dewey Publications Podcast (AI record risk, ~23:45).</w:t>
+        <w:t xml:space="preserve">🎙️ On The Dewey Publications Podcast (AI record risk, ~23:45).</w:t>
       </w:r>
     </w:p>
     <w:p>

</xml_diff>